<commit_message>
saving the new analysor jupyters and changes to the code so far, the logic is mainly working correctly but the project lacks unity across the files
</commit_message>
<xml_diff>
--- a/Documentation/Logbook.docx
+++ b/Documentation/Logbook.docx
@@ -2491,6 +2491,62 @@
           <w:b/>
         </w:rPr>
         <w:t xml:space="preserve">Extracting the hidden states from the frozen models didn’t need as much computational power as training a simple probe, for my next actions I will further optimise the code for probing and the extraction, my main concern is the integrity of the data, I want to make sure the code I’m developing cleverly maps everything together and keeps track of inputs from the beginning of cleaning the dataset to when we are  representing the layer wise probing system.  I will also work on the project files and keep the root clean. </w:t>
+      </w:r>
+    </w:p>
+    <w:p>
+      <w:pPr>
+        <w:spacing w:after="331"/>
+      </w:pPr>
+      <w:r>
+        <w:rPr>
+          <w:rFonts w:ascii="Times" w:hAnsi="Times" w:cs="Times"/>
+          <w:sz w:val="24"/>
+          <w:sz-cs w:val="24"/>
+          <w:b/>
+        </w:rPr>
+        <w:t xml:space="preserve">30/8/2026</w:t>
+      </w:r>
+    </w:p>
+    <w:p>
+      <w:pPr>
+        <w:spacing w:after="331"/>
+      </w:pPr>
+      <w:r>
+        <w:rPr>
+          <w:rFonts w:ascii="Times" w:hAnsi="Times" w:cs="Times"/>
+          <w:sz w:val="24"/>
+          <w:sz-cs w:val="24"/>
+          <w:b/>
+        </w:rPr>
+        <w:t xml:space="preserve">I have made significant changes to my code and have several backups, linking the dataset cleaning -&gt; extracting the hidden states -&gt;  training probes on the hidden states (labels remain the target) -&gt; validating on the datasets -&gt;  compare the layers of the same model -&gt; compare the performance of different models. But what I lack is a unified class which performs all this with a model name and dataset. I am also using advanced AI tools to better structure the workflow of my project.</w:t>
+      </w:r>
+    </w:p>
+    <w:p>
+      <w:pPr>
+        <w:spacing w:after="331"/>
+      </w:pPr>
+      <w:r>
+        <w:rPr>
+          <w:rFonts w:ascii="Times" w:hAnsi="Times" w:cs="Times"/>
+          <w:sz w:val="24"/>
+          <w:sz-cs w:val="24"/>
+          <w:b/>
+        </w:rPr>
+        <w:t xml:space="preserve">-</w:t>
+      </w:r>
+    </w:p>
+    <w:p>
+      <w:pPr>
+        <w:spacing w:after="331"/>
+      </w:pPr>
+      <w:r>
+        <w:rPr>
+          <w:rFonts w:ascii="Times" w:hAnsi="Times" w:cs="Times"/>
+          <w:sz w:val="24"/>
+          <w:sz-cs w:val="24"/>
+          <w:b/>
+        </w:rPr>
+        <w:t xml:space="preserve">-</w:t>
       </w:r>
     </w:p>
     <w:p>

</xml_diff>

<commit_message>
Changed the README.md file, Updated logbook, Improvments in other areas of the project
</commit_message>
<xml_diff>
--- a/Documentation/Logbook.docx
+++ b/Documentation/Logbook.docx
@@ -2532,21 +2532,21 @@
           <w:sz-cs w:val="24"/>
           <w:b/>
         </w:rPr>
-        <w:t xml:space="preserve">-</w:t>
-      </w:r>
-    </w:p>
-    <w:p>
-      <w:pPr>
-        <w:spacing w:after="331"/>
-      </w:pPr>
-      <w:r>
-        <w:rPr>
-          <w:rFonts w:ascii="Times" w:hAnsi="Times" w:cs="Times"/>
-          <w:sz w:val="24"/>
-          <w:sz-cs w:val="24"/>
-          <w:b/>
-        </w:rPr>
-        <w:t xml:space="preserve">-</w:t>
+        <w:t xml:space="preserve">Clean and organised project root,  readme file, comments and documentation. with a version control I can easily trace back the files that are accidentally lost, improved the performance of the analysers for a more robust error check during the runtime of my project before merging it as an application.  </w:t>
+      </w:r>
+    </w:p>
+    <w:p>
+      <w:pPr>
+        <w:spacing w:after="331"/>
+      </w:pPr>
+      <w:r>
+        <w:rPr>
+          <w:rFonts w:ascii="Times" w:hAnsi="Times" w:cs="Times"/>
+          <w:sz w:val="24"/>
+          <w:sz-cs w:val="24"/>
+          <w:b/>
+        </w:rPr>
+        <w:t xml:space="preserve">There are many points to improve, make the extraction code and generalise (*(any) -&gt;(to) *(any)) as possible and make the probe code as fast as possible (after these I can move on to merging them as one python class and application). Next I have to consider how to use the promised QWEN models, different models, different interpretability/explainability methods, different hyper parameters per run. It feels like a never ending fight and you only have an old Swiss pocket knife. The improvement list is not finished either because comparing and cross validating all  the results is just a part of the project and a hunch to find a pattern. There has been a promising progress with the extraction process, however they are all bundled behind a question mark which stains the integrity of the data in the project pipeline. Currently many file saving attempts are in place to stop this, but from deep analysis it can be observed they have been in vain. The long term solution is using OOP designs with classes and inheritance. Even though we are technically not creating an application here, but the methodology will help the project pipeline and possibly allows me to turn this project into a simple interface for probing language models. </w:t>
       </w:r>
     </w:p>
     <w:p>

</xml_diff>

<commit_message>
Improved the code for probes and added atomic writes and pre-run checks for existing probes. made file for demonstrating my pipeline, improvments in other areas.
</commit_message>
<xml_diff>
--- a/Documentation/Logbook.docx
+++ b/Documentation/Logbook.docx
@@ -2547,6 +2547,132 @@
           <w:b/>
         </w:rPr>
         <w:t xml:space="preserve">There are many points to improve, make the extraction code and generalise (*(any) -&gt;(to) *(any)) as possible and make the probe code as fast as possible (after these I can move on to merging them as one python class and application). Next I have to consider how to use the promised QWEN models, different models, different interpretability/explainability methods, different hyper parameters per run. It feels like a never ending fight and you only have an old Swiss pocket knife. The improvement list is not finished either because comparing and cross validating all  the results is just a part of the project and a hunch to find a pattern. There has been a promising progress with the extraction process, however they are all bundled behind a question mark which stains the integrity of the data in the project pipeline. Currently many file saving attempts are in place to stop this, but from deep analysis it can be observed they have been in vain. The long term solution is using OOP designs with classes and inheritance. Even though we are technically not creating an application here, but the methodology will help the project pipeline and possibly allows me to turn this project into a simple interface for probing language models. </w:t>
+      </w:r>
+    </w:p>
+    <w:p>
+      <w:pPr>
+        <w:spacing w:after="331"/>
+      </w:pPr>
+      <w:r>
+        <w:rPr>
+          <w:rFonts w:ascii="Times" w:hAnsi="Times" w:cs="Times"/>
+          <w:sz w:val="24"/>
+          <w:sz-cs w:val="24"/>
+          <w:b/>
+        </w:rPr>
+        <w:t xml:space="preserve"/>
+      </w:r>
+    </w:p>
+    <w:p>
+      <w:pPr>
+        <w:spacing w:after="331"/>
+      </w:pPr>
+      <w:r>
+        <w:rPr>
+          <w:rFonts w:ascii="Times" w:hAnsi="Times" w:cs="Times"/>
+          <w:sz w:val="24"/>
+          <w:sz-cs w:val="24"/>
+          <w:b/>
+        </w:rPr>
+        <w:t xml:space="preserve">1/9/2026</w:t>
+      </w:r>
+    </w:p>
+    <w:p>
+      <w:pPr>
+        <w:spacing w:after="331"/>
+      </w:pPr>
+      <w:r>
+        <w:rPr>
+          <w:rFonts w:ascii="Times" w:hAnsi="Times" w:cs="Times"/>
+          <w:sz w:val="24"/>
+          <w:sz-cs w:val="24"/>
+          <w:b/>
+        </w:rPr>
+        <w:t xml:space="preserve">I have had noticeable progress with refining my code, I am stuck with a slow apple silicon cpu without a way to take advantage of my gpu, therefore I worked more on making my code clean as well as crash and bug free. I haven’t spent much time on documentation as I am falling behind my delivery schedule, due to slow progress and insufficient result to convey meaning from them. </w:t>
+      </w:r>
+    </w:p>
+    <w:p>
+      <w:pPr>
+        <w:spacing w:after="331"/>
+      </w:pPr>
+      <w:r>
+        <w:rPr>
+          <w:rFonts w:ascii="Times" w:hAnsi="Times" w:cs="Times"/>
+          <w:sz w:val="24"/>
+          <w:sz-cs w:val="24"/>
+          <w:b/>
+        </w:rPr>
+        <w:t xml:space="preserve">I have contagious GitHub commits and atomic writes and processing of model’s hidden states as well as probing each layer of the models. Even if my kernel crashes during a fit for a probe, the atomic file writer will save the state of the probe and can progress upon it. This will significantly improve the entire pipeline of my work, training different probes on the whole datasets, different models, repeats and varying hyper parameters needed to be recorded. </w:t>
+      </w:r>
+    </w:p>
+    <w:p>
+      <w:pPr>
+        <w:spacing w:after="331"/>
+      </w:pPr>
+      <w:r>
+        <w:rPr>
+          <w:rFonts w:ascii="Times" w:hAnsi="Times" w:cs="Times"/>
+          <w:sz w:val="24"/>
+          <w:sz-cs w:val="24"/>
+          <w:b/>
+        </w:rPr>
+        <w:t xml:space="preserve">I have made each section of the project I was working on as robust and generalised as possible, mainly for ease of use, since my computer is always running hidden state extraction and training and testing probes so it’s always slow and kernel crashes often, this new approach completely flattens the project with no failure. Moreover, to extend of this problem I am planning on creating a single python class with interface which will correctly execute my separated project files, via a neat interface capturing user’s needs. I hope this project could be found useful for someone else since it can work with a given dataset and a given model name on hugging face. It would ideally pre-process the dataset automatically (we just need the text column and the label) so if somebody decides to use my project, they aren’t asking where does emotion learning happens in LLMs like QWEN, they can ask how recoverable is my question from the answer and what layers are responsible for this ? </w:t>
+      </w:r>
+    </w:p>
+    <w:p>
+      <w:pPr>
+        <w:spacing w:after="331"/>
+      </w:pPr>
+      <w:r>
+        <w:rPr>
+          <w:rFonts w:ascii="Times" w:hAnsi="Times" w:cs="Times"/>
+          <w:sz w:val="24"/>
+          <w:sz-cs w:val="24"/>
+          <w:b/>
+        </w:rPr>
+        <w:t xml:space="preserve">2/9/2026</w:t>
+      </w:r>
+    </w:p>
+    <w:p>
+      <w:pPr>
+        <w:spacing w:after="331"/>
+      </w:pPr>
+      <w:r>
+        <w:rPr>
+          <w:rFonts w:ascii="Times" w:hAnsi="Times" w:cs="Times"/>
+          <w:sz w:val="24"/>
+          <w:sz-cs w:val="24"/>
+          <w:b/>
+        </w:rPr>
+        <w:t xml:space="preserve">-</w:t>
+      </w:r>
+    </w:p>
+    <w:p>
+      <w:pPr>
+        <w:spacing w:after="331"/>
+      </w:pPr>
+      <w:r>
+        <w:rPr>
+          <w:rFonts w:ascii="Times" w:hAnsi="Times" w:cs="Times"/>
+          <w:sz w:val="24"/>
+          <w:sz-cs w:val="24"/>
+          <w:b/>
+        </w:rPr>
+        <w:t xml:space="preserve">-</w:t>
+      </w:r>
+    </w:p>
+    <w:p>
+      <w:pPr>
+        <w:spacing w:after="331"/>
+      </w:pPr>
+      <w:r>
+        <w:rPr>
+          <w:rFonts w:ascii="Times" w:hAnsi="Times" w:cs="Times"/>
+          <w:sz w:val="24"/>
+          <w:sz-cs w:val="24"/>
+          <w:b/>
+        </w:rPr>
+        <w:t xml:space="preserve">-</w:t>
       </w:r>
     </w:p>
     <w:p>

</xml_diff>

<commit_message>
Updated the logbook, Made a readme.md file using the latest 2026 techiques, continue the probing of the models, deleted unecessary files and folders, cleaned project file and folder structure.
</commit_message>
<xml_diff>
--- a/Documentation/Logbook.docx
+++ b/Documentation/Logbook.docx
@@ -2644,7 +2644,63 @@
           <w:sz-cs w:val="24"/>
           <w:b/>
         </w:rPr>
-        <w:t xml:space="preserve">-</w:t>
+        <w:t xml:space="preserve">I have made noticeable changes to the code and overall have improved the speed and pipeline integrity of the code. I don’t have to worry about kernel crashes anymore, I have atomic file writes throughout my project, golden files only for saving the state of the code and will be deleted on full result completion (always only one per probe). </w:t>
+      </w:r>
+    </w:p>
+    <w:p>
+      <w:pPr>
+        <w:spacing w:after="331"/>
+      </w:pPr>
+      <w:r>
+        <w:rPr>
+          <w:rFonts w:ascii="Times" w:hAnsi="Times" w:cs="Times"/>
+          <w:sz w:val="24"/>
+          <w:sz-cs w:val="24"/>
+          <w:b/>
+        </w:rPr>
+        <w:t xml:space="preserve">I have made GitHub commits consistent so there would be other references for the timestamp of this project,  made analysers more robust and able to check the hidden states, project files and probe’s performance integrity.  Moreover, I have made the pipeline file I wanted and it can successfully meet user’s probing needs. However, running this file on large data or big probes would take a lot of time. </w:t>
+      </w:r>
+    </w:p>
+    <w:p>
+      <w:pPr>
+        <w:spacing w:after="331"/>
+      </w:pPr>
+      <w:r>
+        <w:rPr>
+          <w:rFonts w:ascii="Times" w:hAnsi="Times" w:cs="Times"/>
+          <w:sz w:val="24"/>
+          <w:sz-cs w:val="24"/>
+          <w:b/>
+        </w:rPr>
+        <w:t xml:space="preserve">Since my entire project is result centric, I wanted to have this pipeline file for demonstration purposes, maybe it can act as a smaller version of my goals and only demonstrate how we probe a model and provide a visual display of the lifecycle of the data. </w:t>
+      </w:r>
+    </w:p>
+    <w:p>
+      <w:pPr>
+        <w:spacing w:after="331"/>
+      </w:pPr>
+      <w:r>
+        <w:rPr>
+          <w:rFonts w:ascii="Times" w:hAnsi="Times" w:cs="Times"/>
+          <w:sz w:val="24"/>
+          <w:sz-cs w:val="24"/>
+          <w:b/>
+        </w:rPr>
+        <w:t xml:space="preserve">3/9/2026</w:t>
+      </w:r>
+    </w:p>
+    <w:p>
+      <w:pPr>
+        <w:spacing w:after="331"/>
+      </w:pPr>
+      <w:r>
+        <w:rPr>
+          <w:rFonts w:ascii="Times" w:hAnsi="Times" w:cs="Times"/>
+          <w:sz w:val="24"/>
+          <w:sz-cs w:val="24"/>
+          <w:b/>
+        </w:rPr>
+        <w:t xml:space="preserve">I have extracted the hidden states of almost half of the 25 selected model, but I haven’t finished probing the first model (BERT). The pipeline is mainly slow due to the fact we are using 4 different probes with different layer depth and complexity. From my previous experiment, I already know the best performance probes were with 1 and 2 hidden layers respectively. Wish I could resolve these ambiguities with my supervisor. I wouldn’t have ended up with trying to use 4 different probes to put them after each layer of each of the 25v models while thinking maybe I need one or two other datasets for better demonstration of the results. Yes it’s true that we can cross validate them with each other and extract meaning, but it’s more time consuming than that. </w:t>
       </w:r>
     </w:p>
     <w:p>

</xml_diff>

<commit_message>
logbook, readme, cleaned the dataset cleaning process, continue probing. saving changes for the up comming implementations
</commit_message>
<xml_diff>
--- a/Documentation/Logbook.docx
+++ b/Documentation/Logbook.docx
@@ -2714,6 +2714,48 @@
           <w:sz-cs w:val="24"/>
           <w:b/>
         </w:rPr>
+        <w:t xml:space="preserve">Currently, I’m trying to implement a single python class for executing my probing pipeline, I shall use this pipeline to add more explainability and interpretability methods. As if I’m writing a code for understanding the characteristics of any given model. (Which will be directly and relevantly limited to the datasets users provide besides mine)</w:t>
+      </w:r>
+    </w:p>
+    <w:p>
+      <w:pPr>
+        <w:spacing w:after="331"/>
+      </w:pPr>
+      <w:r>
+        <w:rPr>
+          <w:rFonts w:ascii="Times" w:hAnsi="Times" w:cs="Times"/>
+          <w:sz w:val="24"/>
+          <w:sz-cs w:val="24"/>
+          <w:b/>
+        </w:rPr>
+        <w:t xml:space="preserve">I have already implemented most of what I have promised in the specification, however due to slow progress on extraction / probing I have decided to refine my current code further.  For my next action plans, I’m looking for a proper cloud environment for expensive runs (bigger models), a spare laptop or PC for extracting and probing smaller models,  is there a way to take advantage of parallelism (=) and concurrency(-_-_-) with this project ? How to handle atomic cases ? </w:t>
+      </w:r>
+    </w:p>
+    <w:p>
+      <w:pPr>
+        <w:spacing w:after="331"/>
+      </w:pPr>
+      <w:r>
+        <w:rPr>
+          <w:rFonts w:ascii="Times" w:hAnsi="Times" w:cs="Times"/>
+          <w:sz w:val="24"/>
+          <w:sz-cs w:val="24"/>
+          <w:b/>
+        </w:rPr>
+        <w:t xml:space="preserve">3/9/2026</w:t>
+      </w:r>
+    </w:p>
+    <w:p>
+      <w:pPr>
+        <w:spacing w:after="331"/>
+      </w:pPr>
+      <w:r>
+        <w:rPr>
+          <w:rFonts w:ascii="Times" w:hAnsi="Times" w:cs="Times"/>
+          <w:sz w:val="24"/>
+          <w:sz-cs w:val="24"/>
+          <w:b/>
+        </w:rPr>
         <w:t xml:space="preserve">-</w:t>
       </w:r>
     </w:p>
@@ -2733,7 +2775,20 @@
     </w:p>
     <w:p>
       <w:pPr>
-        <w:jc w:val="center"/>
+        <w:spacing w:after="331"/>
+      </w:pPr>
+      <w:r>
+        <w:rPr>
+          <w:rFonts w:ascii="Times" w:hAnsi="Times" w:cs="Times"/>
+          <w:sz w:val="24"/>
+          <w:sz-cs w:val="24"/>
+          <w:b/>
+        </w:rPr>
+        <w:t xml:space="preserve">-</w:t>
+      </w:r>
+    </w:p>
+    <w:p>
+      <w:pPr>
         <w:spacing w:after="331"/>
       </w:pPr>
       <w:r>

</xml_diff>

<commit_message>
preparing for moving the code into new machiens, preparing prequisits, package wheels, model bolbs, code itself, extracted hidden states, probe results, documentation, demonstrations, plots, results, etc.. will heavily change for each new operating system we will have to work with, the key is adapting fast
</commit_message>
<xml_diff>
--- a/Documentation/Logbook.docx
+++ b/Documentation/Logbook.docx
@@ -2743,6 +2743,118 @@
           <w:b/>
         </w:rPr>
         <w:t xml:space="preserve">3/9/2026</w:t>
+      </w:r>
+    </w:p>
+    <w:p>
+      <w:pPr>
+        <w:spacing w:after="331"/>
+      </w:pPr>
+      <w:r>
+        <w:rPr>
+          <w:rFonts w:ascii="Times" w:hAnsi="Times" w:cs="Times"/>
+          <w:sz w:val="24"/>
+          <w:sz-cs w:val="24"/>
+          <w:b/>
+        </w:rPr>
+        <w:t xml:space="preserve">I have had significant progress with correcting the probing code explicitly, new documentation files, modifications to the rest of the code, plus changes in naming conviction. </w:t>
+      </w:r>
+    </w:p>
+    <w:p>
+      <w:pPr>
+        <w:spacing w:after="331"/>
+      </w:pPr>
+      <w:r>
+        <w:rPr>
+          <w:rFonts w:ascii="Times" w:hAnsi="Times" w:cs="Times"/>
+          <w:sz w:val="24"/>
+          <w:sz-cs w:val="24"/>
+          <w:b/>
+        </w:rPr>
+        <w:t xml:space="preserve">The probing code now can successfully save the probe’s state for a trial with a set of hyperparameters, I have gathered information and resources on how to move the code and explicitly the extraction and probing on two different machines, I have updated analyses code and probe code bundle logic, changed the name of the files for ease of typography and convenience in conviction. </w:t>
+      </w:r>
+    </w:p>
+    <w:p>
+      <w:pPr>
+        <w:spacing w:after="331"/>
+      </w:pPr>
+      <w:r>
+        <w:rPr>
+          <w:rFonts w:ascii="Times" w:hAnsi="Times" w:cs="Times"/>
+          <w:sz w:val="24"/>
+          <w:sz-cs w:val="24"/>
+          <w:b/>
+        </w:rPr>
+        <w:t xml:space="preserve">The code will be moved to different machines to split the load of the work on different cpus. The code is poorly documented and there are vague parts needed to be explained, the probing code should be sound proof similar to the extraction code (more trust worthy), although what I’m doing with probes isn’t fundamentally trustworthier than the extraction process, so it’s normal to have some vague areas and ambiguities relatively speaking to the correctness of the extraction and probing process. </w:t>
+      </w:r>
+    </w:p>
+    <w:p>
+      <w:pPr>
+        <w:spacing w:after="331"/>
+      </w:pPr>
+      <w:r>
+        <w:rPr>
+          <w:rFonts w:ascii="Times" w:hAnsi="Times" w:cs="Times"/>
+          <w:sz w:val="24"/>
+          <w:sz-cs w:val="24"/>
+          <w:b/>
+        </w:rPr>
+        <w:t xml:space="preserve">4/9/2026</w:t>
+      </w:r>
+    </w:p>
+    <w:p>
+      <w:pPr>
+        <w:spacing w:after="331"/>
+      </w:pPr>
+      <w:r>
+        <w:rPr>
+          <w:rFonts w:ascii="Times" w:hAnsi="Times" w:cs="Times"/>
+          <w:sz w:val="24"/>
+          <w:sz-cs w:val="24"/>
+          <w:b/>
+        </w:rPr>
+        <w:t xml:space="preserve">Progress with moving the code to new machines, new documentations / guidelines and steps needed to be taken for completion of the project’s code. Bigger dreams in the absence of my supervisor. There are many areas of the code that need improvement, currently the only sophisticatedly completed file in my project is extraction file, which was easy to get it work atomically with the frozen models. </w:t>
+      </w:r>
+    </w:p>
+    <w:p>
+      <w:pPr>
+        <w:spacing w:after="331"/>
+      </w:pPr>
+      <w:r>
+        <w:rPr>
+          <w:rFonts w:ascii="Times" w:hAnsi="Times" w:cs="Times"/>
+          <w:sz w:val="24"/>
+          <w:sz-cs w:val="24"/>
+          <w:b/>
+        </w:rPr>
+        <w:t xml:space="preserve">The core idea of what I’m doing is manual concurrency and parallelism,  for speeding up the pipeline of the project, next I will fall back to generalising the codes a bit further, so that it would look closer to a python library, maybe I could establish it as one in future. To be able to probe any model using any dataset with manual configuration for probes is genuinely a useful library, if it had existed, it would have made my work a whole lot easier. </w:t>
+      </w:r>
+    </w:p>
+    <w:p>
+      <w:pPr>
+        <w:spacing w:after="331"/>
+      </w:pPr>
+      <w:r>
+        <w:rPr>
+          <w:rFonts w:ascii="Times" w:hAnsi="Times" w:cs="Times"/>
+          <w:sz w:val="24"/>
+          <w:sz-cs w:val="24"/>
+          <w:b/>
+        </w:rPr>
+        <w:t xml:space="preserve">Thinking about actually implementing concurrency and parallelism with collision checks sounds like the biggest hassle that can come into my mind right now, considering the scope of my project and the type of machines and cpus I’m working with this sounds more like a dream to achieve.</w:t>
+      </w:r>
+    </w:p>
+    <w:p>
+      <w:pPr>
+        <w:spacing w:after="331"/>
+      </w:pPr>
+      <w:r>
+        <w:rPr>
+          <w:rFonts w:ascii="Times" w:hAnsi="Times" w:cs="Times"/>
+          <w:sz w:val="24"/>
+          <w:sz-cs w:val="24"/>
+          <w:b/>
+        </w:rPr>
+        <w:t xml:space="preserve">5/9/2026</w:t>
       </w:r>
     </w:p>
     <w:p>

</xml_diff>

<commit_message>
Saving changes, while unifying the pipeline files.
</commit_message>
<xml_diff>
--- a/Documentation/Logbook.docx
+++ b/Documentation/Logbook.docx
@@ -2869,6 +2869,62 @@
           <w:b/>
         </w:rPr>
         <w:t xml:space="preserve">I have spent days trying to move my project into a slower incompatible pc and laptop, I can’t keep track of the entire file system, I should either split the extraction / probe, or datasets, I have to split the work wisely between the available hardware that I have. For example the Mac computer lacks loading QWEN 7b but it can slowly but surely load smaller models. Maybe I can split the work like this. </w:t>
+      </w:r>
+    </w:p>
+    <w:p>
+      <w:pPr>
+        <w:spacing w:after="331"/>
+      </w:pPr>
+      <w:r>
+        <w:rPr>
+          <w:rFonts w:ascii="Times" w:hAnsi="Times" w:cs="Times"/>
+          <w:sz w:val="24"/>
+          <w:sz-cs w:val="24"/>
+          <w:b/>
+        </w:rPr>
+        <w:t xml:space="preserve">Worked on another version of the pipline file and managed to bundle all the pipeline files into one main pipeline file for my project, which has more demonstration purposes than actually extracting or probing models on full datasets, it provides a user friendly explanation of what we are doing here exactly. </w:t>
+      </w:r>
+    </w:p>
+    <w:p>
+      <w:pPr>
+        <w:spacing w:after="331"/>
+      </w:pPr>
+      <w:r>
+        <w:rPr>
+          <w:rFonts w:ascii="Times" w:hAnsi="Times" w:cs="Times"/>
+          <w:sz w:val="24"/>
+          <w:sz-cs w:val="24"/>
+          <w:b/>
+        </w:rPr>
+        <w:t xml:space="preserve">I have already optimised most areas of the extraction / probing code,  I can work on other files when they run on the background and I can make audit experiments for the generated CSVs and plots.  I am building package wheels and setting up installers, preparing the code (paths), light-weight runners, matching versions and dependancies,  requirements and machine system files and operating system file requirements. All of which would be easier if I create a python class and can regulate the entire process from its constructor and parallel checks and calls. </w:t>
+      </w:r>
+    </w:p>
+    <w:p>
+      <w:pPr>
+        <w:spacing w:after="331"/>
+      </w:pPr>
+      <w:r>
+        <w:rPr>
+          <w:rFonts w:ascii="Times" w:hAnsi="Times" w:cs="Times"/>
+          <w:sz w:val="24"/>
+          <w:sz-cs w:val="24"/>
+          <w:b/>
+        </w:rPr>
+        <w:t xml:space="preserve">6/9/2026</w:t>
+      </w:r>
+    </w:p>
+    <w:p>
+      <w:pPr>
+        <w:spacing w:after="331"/>
+      </w:pPr>
+      <w:r>
+        <w:rPr>
+          <w:rFonts w:ascii="Times" w:hAnsi="Times" w:cs="Times"/>
+          <w:sz w:val="24"/>
+          <w:sz-cs w:val="24"/>
+          <w:b/>
+        </w:rPr>
+        <w:t xml:space="preserve">-</w:t>
       </w:r>
     </w:p>
     <w:p>

</xml_diff>

<commit_message>
finished pipeline, now we have a stand alone file for regular and  project space tasks, very helpful when dealing with billions of files scattered around the project's results folder
</commit_message>
<xml_diff>
--- a/Documentation/Logbook.docx
+++ b/Documentation/Logbook.docx
@@ -2924,21 +2924,21 @@
           <w:sz-cs w:val="24"/>
           <w:b/>
         </w:rPr>
-        <w:t xml:space="preserve">-</w:t>
-      </w:r>
-    </w:p>
-    <w:p>
-      <w:pPr>
-        <w:spacing w:after="331"/>
-      </w:pPr>
-      <w:r>
-        <w:rPr>
-          <w:rFonts w:ascii="Times" w:hAnsi="Times" w:cs="Times"/>
-          <w:sz w:val="24"/>
-          <w:sz-cs w:val="24"/>
-          <w:b/>
-        </w:rPr>
-        <w:t xml:space="preserve">-</w:t>
+        <w:t xml:space="preserve">Finished the work with pipeline for visualisation and demonstrations, modified the probe code to fix a problem during the run when repeats are set to 1. Improved the logic of the pipeline file, introduced new commands and novel approaches.</w:t>
+      </w:r>
+    </w:p>
+    <w:p>
+      <w:pPr>
+        <w:spacing w:after="331"/>
+      </w:pPr>
+      <w:r>
+        <w:rPr>
+          <w:rFonts w:ascii="Times" w:hAnsi="Times" w:cs="Times"/>
+          <w:sz w:val="24"/>
+          <w:sz-cs w:val="24"/>
+          <w:b/>
+        </w:rPr>
+        <w:t xml:space="preserve"/>
       </w:r>
     </w:p>
     <w:p>

</xml_diff>